<commit_message>
Fix BIBB Word attendance logos and participant row counts
</commit_message>
<xml_diff>
--- a/storage/vorlage/projekte/bop/word/bo/Teilnehmendenliste_zum_Nachweis_der_praktischen_Berufsorientierung_A3.docx
+++ b/storage/vorlage/projekte/bop/word/bo/Teilnehmendenliste_zum_Nachweis_der_praktischen_Berufsorientierung_A3.docx
@@ -17189,10 +17189,10 @@
     <w:sectPr>
       <w:headerReference w:type="even" r:id="rId7"/>
       <w:headerReference w:type="default" r:id="rId8"/>
-      <w:footerReference w:type="even" r:id="rId9"/>
+      <w:footerReference w:type="even" r:id="rId10"/>
       <w:footerReference w:type="default" r:id="rId10"/>
       <w:headerReference w:type="first" r:id="rId11"/>
-      <w:footerReference w:type="first" r:id="rId12"/>
+      <w:footerReference w:type="first" r:id="rId10"/>
       <w:pgSz w:w="23811" w:h="16838" w:orient="landscape" w:code="8"/>
       <w:pgMar w:top="1258" w:right="1080" w:bottom="1440" w:left="1080" w:header="1418" w:footer="567" w:gutter="0"/>
       <w:cols w:space="708"/>

</xml_diff>